<commit_message>
Se modificó el informe -- Juego listo para prod
</commit_message>
<xml_diff>
--- a/Informe TP1.docx
+++ b/Informe TP1.docx
@@ -203,14 +203,7 @@
         <w:rPr>
           <w:rFonts w:ascii="Times New Roman" w:hAnsi="Times New Roman" w:cs="Times New Roman"/>
         </w:rPr>
-        <w:t xml:space="preserve">" funcionara correctamente. Este componente visual presentó dificultades tanto a nivel de diseño como en su implementación, lo que requirió varios intentos hasta lograr que se comportara como </w:t>
-      </w:r>
-      <w:r>
-        <w:rPr>
-          <w:rFonts w:ascii="Times New Roman" w:hAnsi="Times New Roman" w:cs="Times New Roman"/>
-        </w:rPr>
-        <w:lastRenderedPageBreak/>
-        <w:t>esperábamos. En particular, tuvimos problemas al intentar que la matriz del juego se dibujara correctamente en función de las selecciones del usuario</w:t>
+        <w:t>" funcionara correctamente. Este componente visual presentó dificultades tanto a nivel de diseño como en su implementación, lo que requirió varios intentos hasta lograr que se comportara como esperábamos. En particular, tuvimos problemas al intentar que la matriz del juego se dibujara correctamente en función de las selecciones del usuario</w:t>
       </w:r>
       <w:r>
         <w:rPr>
@@ -264,7 +257,88 @@
         <w:rPr>
           <w:rFonts w:ascii="Times New Roman" w:hAnsi="Times New Roman" w:cs="Times New Roman"/>
         </w:rPr>
+        <w:t>Por otro lado, teniendo en cuenta las correcciones de la primer entrega, encontramos desafiante el hecho de que los movimientos se realicen mediante el teclado. Cabe remarcar que el movimiento con el teclado funciona si y solo si se hace “</w:t>
+      </w:r>
+      <w:proofErr w:type="spellStart"/>
+      <w:r>
+        <w:rPr>
+          <w:rFonts w:ascii="Times New Roman" w:hAnsi="Times New Roman" w:cs="Times New Roman"/>
+        </w:rPr>
+        <w:t>click</w:t>
+      </w:r>
+      <w:proofErr w:type="spellEnd"/>
+      <w:r>
+        <w:rPr>
+          <w:rFonts w:ascii="Times New Roman" w:hAnsi="Times New Roman" w:cs="Times New Roman"/>
+        </w:rPr>
+        <w:t>” en la pantalla del juego (como cualquier pestaña de navegador).</w:t>
+      </w:r>
+    </w:p>
+    <w:p>
+      <w:pPr>
+        <w:spacing w:line="360" w:lineRule="auto"/>
+        <w:jc w:val="both"/>
+        <w:rPr>
+          <w:rFonts w:ascii="Times New Roman" w:hAnsi="Times New Roman" w:cs="Times New Roman"/>
+        </w:rPr>
+      </w:pPr>
+      <w:r>
+        <w:rPr>
+          <w:rFonts w:ascii="Times New Roman" w:hAnsi="Times New Roman" w:cs="Times New Roman"/>
+        </w:rPr>
         <w:t>Además, discutimos en detalle cómo debía implementarse el sistema de récords del juego. Finalmente, llegamos a la conclusión de que el criterio adecuado para registrar el récord sería la menor cantidad de movimientos necesarios para completar la matriz, lo que alineaba bien con la mecánica del juego y brindaba un objetivo claro para los jugadores.</w:t>
+      </w:r>
+    </w:p>
+    <w:p>
+      <w:pPr>
+        <w:spacing w:line="360" w:lineRule="auto"/>
+        <w:jc w:val="both"/>
+        <w:rPr>
+          <w:rFonts w:ascii="Times New Roman" w:hAnsi="Times New Roman" w:cs="Times New Roman"/>
+        </w:rPr>
+      </w:pPr>
+    </w:p>
+    <w:p>
+      <w:pPr>
+        <w:spacing w:line="360" w:lineRule="auto"/>
+        <w:jc w:val="both"/>
+        <w:rPr>
+          <w:rFonts w:ascii="Times New Roman" w:hAnsi="Times New Roman" w:cs="Times New Roman"/>
+        </w:rPr>
+      </w:pPr>
+      <w:r>
+        <w:rPr>
+          <w:rFonts w:ascii="Times New Roman" w:hAnsi="Times New Roman" w:cs="Times New Roman"/>
+        </w:rPr>
+        <w:t>También, encontramos desafiante las correcciones de los profesores, lo que nos hizo trabajar duro para poder encontrar soluciones a los problemas que teníamos previamente. Luego de múltiples discusiones pudimos llegar a un acuerdo con el equipo y encontramos una manera de resolver los problemas que teníamos, con un tipo de implementación que se asemeja al “</w:t>
+      </w:r>
+      <w:proofErr w:type="spellStart"/>
+      <w:r>
+        <w:rPr>
+          <w:rFonts w:ascii="Times New Roman" w:hAnsi="Times New Roman" w:cs="Times New Roman"/>
+        </w:rPr>
+        <w:t>forms</w:t>
+      </w:r>
+      <w:proofErr w:type="spellEnd"/>
+      <w:r>
+        <w:rPr>
+          <w:rFonts w:ascii="Times New Roman" w:hAnsi="Times New Roman" w:cs="Times New Roman"/>
+        </w:rPr>
+        <w:t xml:space="preserve"> and </w:t>
+      </w:r>
+      <w:proofErr w:type="spellStart"/>
+      <w:r>
+        <w:rPr>
+          <w:rFonts w:ascii="Times New Roman" w:hAnsi="Times New Roman" w:cs="Times New Roman"/>
+        </w:rPr>
+        <w:t>controls</w:t>
+      </w:r>
+      <w:proofErr w:type="spellEnd"/>
+      <w:r>
+        <w:rPr>
+          <w:rFonts w:ascii="Times New Roman" w:hAnsi="Times New Roman" w:cs="Times New Roman"/>
+        </w:rPr>
+        <w:t xml:space="preserve">” </w:t>
       </w:r>
     </w:p>
     <w:p>
@@ -342,7 +416,37 @@
         <w:rPr>
           <w:rFonts w:ascii="Times New Roman" w:hAnsi="Times New Roman" w:cs="Times New Roman"/>
         </w:rPr>
-        <w:t>En conclusión, el proceso de desarrollo de este trabajo práctico no solo nos permitió adquirir nuevos conocimientos y enfrentar desafíos técnicos, sino también aplicar los conceptos aprendidos en clase para crear un producto final funcional, limpio y eficiente. Estamos satisfechos con el resultado obtenido y confiamos en que los usuarios disfrutarán del juego que hemos creado.</w:t>
+        <w:t xml:space="preserve">En conclusión, el proceso de desarrollo de este trabajo práctico no solo nos permitió adquirir nuevos conocimientos y enfrentar desafíos técnicos, sino también aplicar los conceptos aprendidos en clase para crear un producto final funcional, limpio y eficiente. </w:t>
+      </w:r>
+    </w:p>
+    <w:p>
+      <w:pPr>
+        <w:spacing w:line="360" w:lineRule="auto"/>
+        <w:jc w:val="both"/>
+        <w:rPr>
+          <w:rFonts w:ascii="Times New Roman" w:hAnsi="Times New Roman" w:cs="Times New Roman"/>
+        </w:rPr>
+      </w:pPr>
+      <w:r>
+        <w:rPr>
+          <w:rFonts w:ascii="Times New Roman" w:hAnsi="Times New Roman" w:cs="Times New Roman"/>
+        </w:rPr>
+        <w:t>Además, consideramos que las correcciones que nos dieron fueron críticas y constructivas, lo que hizo que reflexionemos sobre los temas vistos en clase para así poder implementarlos de mejor manera en la práctica.</w:t>
+      </w:r>
+    </w:p>
+    <w:p>
+      <w:pPr>
+        <w:spacing w:line="360" w:lineRule="auto"/>
+        <w:jc w:val="both"/>
+        <w:rPr>
+          <w:rFonts w:ascii="Times New Roman" w:hAnsi="Times New Roman" w:cs="Times New Roman"/>
+        </w:rPr>
+      </w:pPr>
+      <w:r>
+        <w:rPr>
+          <w:rFonts w:ascii="Times New Roman" w:hAnsi="Times New Roman" w:cs="Times New Roman"/>
+        </w:rPr>
+        <w:t>Estamos satisfechos con el resultado obtenido y confiamos en que los usuarios disfrutarán del juego que hemos creado.</w:t>
       </w:r>
     </w:p>
     <w:sectPr>
@@ -472,8 +576,6 @@
     <w:r>
       <w:t xml:space="preserve"> Acosta</w:t>
     </w:r>
-    <w:bookmarkStart w:id="0" w:name="_GoBack"/>
-    <w:bookmarkEnd w:id="0"/>
   </w:p>
   <w:p>
     <w:pPr>

</xml_diff>